<commit_message>
docs: update demo video script narration to 'Rethicsec' (post-rename)
</commit_message>
<xml_diff>
--- a/docs/DEMO_VIDEO_SCRIPT.docx
+++ b/docs/DEMO_VIDEO_SCRIPT.docx
@@ -12,7 +12,7 @@
           <w:color w:val="2D1B14"/>
           <w:sz w:val="40"/>
         </w:rPr>
-        <w:t>RethicsAI — 5-Minute Demo Video Script</w:t>
+        <w:t>Rethicsec — 5-Minute Demo Video Script</w:t>
       </w:r>
     </w:p>
     <w:p>
@@ -203,7 +203,7 @@
               <w:rPr>
                 <w:sz w:val="18"/>
               </w:rPr>
-              <w:t>This is RethicsAI — a scam-defence app for Africa. Across the continent, mobile-money, advance-fee and phishing scams cost everyday users real money. RethicsAI answers one question instantly: is this message a scam? — and helps you act on it.</w:t>
+              <w:t>This is Rethicsec — a scam-defence app for Africa. Across the continent, mobile-money, advance-fee and phishing scams cost everyday users real money. Rethicsec answers one question instantly: is this message a scam? — and helps you act on it.</w:t>
             </w:r>
           </w:p>
         </w:tc>
@@ -332,7 +332,7 @@
               <w:rPr>
                 <w:sz w:val="18"/>
               </w:rPr>
-              <w:t>A verdict isn't enough — RethicsAI helps me act. It shows the real cyber-crime and police units for my country, and I can switch country here; all 14 are covered. One tap calls them, emails a report, or opens the official portal, pre-filled.</w:t>
+              <w:t>A verdict isn't enough — Rethicsec helps me act. It shows the real cyber-crime and police units for my country, and I can switch country here; all 14 are covered. One tap calls them, emails a report, or opens the official portal, pre-filled.</w:t>
             </w:r>
           </w:p>
         </w:tc>
@@ -547,7 +547,7 @@
               <w:rPr>
                 <w:sz w:val="18"/>
               </w:rPr>
-              <w:t>All three objectives are met: a labelled scam corpus, a working detection-and-reporting platform, and a custom classifier at 0.955 macro-F1. The next step is collecting more local scam data. RethicsAI — know the scam, stop the scam.</w:t>
+              <w:t>All three objectives are met: a labelled scam corpus, a working detection-and-reporting platform, and a custom classifier at 0.955 macro-F1. The next step is collecting more local scam data. Rethicsec — know the scam, stop the scam.</w:t>
             </w:r>
           </w:p>
         </w:tc>
@@ -1037,7 +1037,7 @@
                 <w:i/>
                 <w:sz w:val="22"/>
               </w:rPr>
-              <w:t>“To wrap up: all three objectives were met. I built a labelled, four-class scam corpus; I delivered a working detection-and-reporting platform that's deployed and installable; and I trained a custom classifier that reaches a macro-F1 of about 0.955. The honest limit is that this score holds best on familiar messages — newer or rarer scams are harder, mainly because the training data is still light on mobile-money and advance-fee examples. That's also the clearest way forward: more real, local scam data will lift accuracy the most. What makes RethicsAI matter is that it doesn't stop at a verdict — it turns detection into action, in the user's own language. RethicsAI: know the scam, stop the scam.”</w:t>
+              <w:t>“To wrap up: all three objectives were met. I built a labelled, four-class scam corpus; I delivered a working detection-and-reporting platform that's deployed and installable; and I trained a custom classifier that reaches a macro-F1 of about 0.955. The honest limit is that this score holds best on familiar messages — newer or rarer scams are harder, mainly because the training data is still light on mobile-money and advance-fee examples. That's also the clearest way forward: more real, local scam data will lift accuracy the most. What makes Rethicsec matter is that it doesn't stop at a verdict — it turns detection into action, in the user's own language. Rethicsec: know the scam, stop the scam.”</w:t>
             </w:r>
           </w:p>
         </w:tc>

</xml_diff>

<commit_message>
docs(demo-script): update for v2 multilingual model
- Reflect the v2 corpus (9,623 msgs, en/pt/sw) and best model (TF-IDF + LogReg
  0.946); mobile-money now the strongest class.
- Swap scanner input #2 to a verified Swahili mobile-money lure to showcase the
  multilingual model on camera; refresh hook + scanner + close narration.
- Update both closing scripts (Option A/B) to the v2 story (acted on the data
  constraint by adding real African data) and the faster v2 cold-start.
</commit_message>
<xml_diff>
--- a/docs/DEMO_VIDEO_SCRIPT.docx
+++ b/docs/DEMO_VIDEO_SCRIPT.docx
@@ -56,7 +56,7 @@
         <w:pStyle w:val="ListBullet"/>
       </w:pPr>
       <w:r>
-        <w:t>Warm up the model first: open the Scanner and run any scan, then wait ~30–60s. The ML Space sleeps when idle; warming it up means your demo scans show the AI model verdict, not the heuristic fallback.</w:t>
+        <w:t>Warm up the model first: open the Scanner and run any scan, then wait ~5–10s. The v2 model is lightweight (no large download), so it only needs the idle Space to wake; warming it up means your demo scans show the AI model verdict, not the heuristic fallback.</w:t>
       </w:r>
     </w:p>
     <w:p>
@@ -203,7 +203,7 @@
               <w:rPr>
                 <w:sz w:val="18"/>
               </w:rPr>
-              <w:t>This is Rethicsec — a scam-defence app for Africa. Across the continent, mobile-money, advance-fee and phishing scams cost everyday users real money. Rethicsec answers one question instantly: is this message a scam? — and helps you act on it.</w:t>
+              <w:t>This is Rethicsec — a scam-defence app for Africa. Across the continent, mobile-money, advance-fee and phishing scams cost everyday users real money — in many local languages. Rethicsec answers one question instantly, in English, Swahili or Portuguese: is this message a scam? — and helps you act on it.</w:t>
             </w:r>
           </w:p>
         </w:tc>
@@ -276,7 +276,7 @@
               <w:rPr>
                 <w:sz w:val="18"/>
               </w:rPr>
-              <w:t>Tap Scanner. Paste each of the 4 messages, scan, let the verdict appear.</w:t>
+              <w:t>Tap Scanner. Paste each of the 4 messages, scan, let the verdict appear. (Message 2 is in Swahili.)</w:t>
             </w:r>
           </w:p>
         </w:tc>
@@ -289,7 +289,7 @@
               <w:rPr>
                 <w:sz w:val="18"/>
               </w:rPr>
-              <w:t>The heart of the app is the scanner. Let me test it with different kinds of messages. [advance-fee] Here's an advance-fee scam — the AI flags it HIGH RISK and tells me why. [repeat for mobile-money, phishing] [safe] And a normal message comes back SAFE — so it doesn't cry wolf.</w:t>
+              <w:t>The heart of the app is the scanner. Let me test it with different kinds of messages. [advance-fee] Here's an advance-fee scam — the AI flags it HIGH RISK and tells me why. [mobile-money, Swahili] This next one is a mobile-money scam written in Swahili — and the model still catches it as mobile-money fraud, because it's trained on real African messages in three languages. [phishing] [safe] And a normal message comes back SAFE — so it doesn't cry wolf.</w:t>
             </w:r>
           </w:p>
         </w:tc>
@@ -547,7 +547,7 @@
               <w:rPr>
                 <w:sz w:val="18"/>
               </w:rPr>
-              <w:t>All three objectives are met: a labelled scam corpus, a working detection-and-reporting platform, and a custom classifier at 0.955 macro-F1. The next step is collecting more local scam data. Rethicsec — know the scam, stop the scam.</w:t>
+              <w:t>All three objectives are met: a labelled, three-language scam corpus, a working detection-and-reporting platform, and a custom classifier at 0.946 macro-F1 that now reads English, Portuguese and Swahili. Adding real African data made mobile-money fraud our strongest class. Rethicsec — know the scam, stop the scam.</w:t>
             </w:r>
           </w:p>
         </w:tc>
@@ -651,7 +651,7 @@
               <w:rPr>
                 <w:sz w:val="18"/>
               </w:rPr>
-              <w:t>Advance-fee</w:t>
+              <w:t>Advance-fee (EN)</w:t>
             </w:r>
           </w:p>
         </w:tc>
@@ -692,7 +692,7 @@
               <w:rPr>
                 <w:sz w:val="18"/>
               </w:rPr>
-              <w:t>Mobile-money</w:t>
+              <w:t>Mobile-money (Swahili)</w:t>
             </w:r>
           </w:p>
         </w:tc>
@@ -705,7 +705,7 @@
               <w:rPr>
                 <w:sz w:val="18"/>
               </w:rPr>
-              <w:t>Your MoMo account will be blocked today. Dial *123*PIN# now to verify your wallet and avoid suspension.</w:t>
+              <w:t>Iyo pesa itume kwenye namba hii ya Airtel 0689933027, jina PETER NYANGE.  (Swahili: “Send that money to this Airtel number, name Peter Nyange.” — a real Tanzanian mobile-money lure.)</w:t>
             </w:r>
           </w:p>
         </w:tc>
@@ -733,7 +733,7 @@
               <w:rPr>
                 <w:sz w:val="18"/>
               </w:rPr>
-              <w:t>Phishing</w:t>
+              <w:t>Phishing (EN)</w:t>
             </w:r>
           </w:p>
         </w:tc>
@@ -774,7 +774,7 @@
               <w:rPr>
                 <w:sz w:val="18"/>
               </w:rPr>
-              <w:t>Safe</w:t>
+              <w:t>Safe (EN)</w:t>
             </w:r>
           </w:p>
         </w:tc>
@@ -902,7 +902,7 @@
               <w:rPr>
                 <w:sz w:val="18"/>
               </w:rPr>
-              <w:t>0:35–2:05 — four different scanner inputs → four verdicts</w:t>
+              <w:t>0:35–2:05 — four different scanner inputs across two languages (incl. a Swahili scam) → four verdicts</w:t>
             </w:r>
           </w:p>
         </w:tc>
@@ -986,7 +986,7 @@
               <w:rPr>
                 <w:sz w:val="18"/>
               </w:rPr>
-              <w:t>4:40 close — collect more local scam data</w:t>
+              <w:t>4:40 close — collect more English mobile-money + advance-fee data (the remaining gaps)</w:t>
             </w:r>
           </w:p>
         </w:tc>
@@ -1037,7 +1037,7 @@
                 <w:i/>
                 <w:sz w:val="22"/>
               </w:rPr>
-              <w:t>“To wrap up: all three objectives were met. I built a labelled, four-class scam corpus; I delivered a working detection-and-reporting platform that's deployed and installable; and I trained a custom classifier that reaches a macro-F1 of about 0.955. The honest limit is that this score holds best on familiar messages — newer or rarer scams are harder, mainly because the training data is still light on mobile-money and advance-fee examples. That's also the clearest way forward: more real, local scam data will lift accuracy the most. What makes Rethicsec matter is that it doesn't stop at a verdict — it turns detection into action, in the user's own language. Rethicsec: know the scam, stop the scam.”</w:t>
+              <w:t>“To wrap up: all three objectives were met. I built a labelled, four-class scam corpus that now spans three languages — English, Portuguese and Swahili; I delivered a working detection-and-reporting platform that's deployed and installable; and I trained a custom classifier that reaches a macro-F1 of about 0.946. After adding real African data, mobile-money fraud became the model's strongest class, and it works across all three languages. The honest limit that remains is advance-fee fraud and English mobile-money messages, where data is still thinner — so the clearest way forward is collecting more of that local scam data. What makes Rethicsec matter is that it doesn't stop at a verdict — it turns detection into action, in the user's own language. Rethicsec: know the scam, stop the scam.”</w:t>
             </w:r>
           </w:p>
         </w:tc>
@@ -1076,7 +1076,7 @@
                 <w:i/>
                 <w:sz w:val="22"/>
               </w:rPr>
-              <w:t>“Let me analyse the results against the proposal. Objective one, the labelled scam corpus, was achieved: roughly four thousand four hundred messages across four classes — advance-fee, mobile-money, phishing, and not-a-scam. Objective two, a working platform, was achieved and is what you've just seen: scanning, country-aware reporting, education, an assistant, and an admin console, deployed as an installable app. Objective three, the classifier, was also achieved — a TF-IDF and multilingual embedding ensemble at about 0.955 macro-F1.”</w:t>
+              <w:t>“Let me analyse the results against the proposal. Objective one, the labelled scam corpus, was achieved and then grown: about nine thousand six hundred messages across four classes — advance-fee, mobile-money, phishing, and not-a-scam — and across three languages, English, Portuguese and Swahili, after I added two real African SMS datasets. Objective two, a working platform, was achieved and is what you've just seen: scanning, country-aware reporting, education, an assistant, and an admin console, deployed as an installable app. Objective three, the classifier, was also achieved — I compared six models, and the best on this larger corpus is a TF-IDF and logistic-regression model at about 0.946 macro-F1, served as a lightweight API.”</w:t>
             </w:r>
           </w:p>
         </w:tc>
@@ -1104,7 +1104,7 @@
                 <w:i/>
                 <w:sz w:val="22"/>
               </w:rPr>
-              <w:t>“Where it fell short of the ideal is on unfamiliar messages: the model inherits a bias toward phishing because that class dominates the data, so some genuine mobile-money scams get mislabelled. Importantly, re-balancing experiments did not fix those cases — which tells me the real constraint is the amount of authentic local data, not the algorithm.”</w:t>
+              <w:t>“At the first milestone the model was biased toward phishing because that class dominated the data, and re-balancing experiments did not fix it — which told me the real constraint was the amount of authentic local data, not the algorithm. So I acted on that: I added real African messages, including Swahili mobile-money lures, and the result is direct — mobile-money fraud went from the weakest class to the strongest, and per-language accuracy is strong across all three languages. The remaining gaps are advance-fee volume and English mobile-money data.”</w:t>
             </w:r>
           </w:p>
         </w:tc>
@@ -1132,7 +1132,7 @@
                 <w:i/>
                 <w:sz w:val="22"/>
               </w:rPr>
-              <w:t>“Why does this milestone matter? Because detection alone doesn't protect anyone. The impact here is the full loop — a verdict a non-technical user can read, in their language, plus a one-tap path to report it to a real authority. My recommendation is to keep collecting verified local scam reports, which both improves the model and builds a data advantage no competitor can copy by adding a language pack.”</w:t>
+              <w:t>“Why does this milestone matter? Because detection alone doesn't protect anyone. The impact here is the full loop — a verdict a non-technical user can read, in their own language, plus a one-tap path to report it to a real authority. My recommendation is to keep collecting verified local scam reports, which both improves the model and builds a data advantage no competitor can copy by adding a language pack.”</w:t>
             </w:r>
           </w:p>
         </w:tc>

</xml_diff>